<commit_message>
Ajusta la plantilla de Archivo del Procedimiento al modelo real
- Agrega el escudo del Perú en el encabezado (el mismo que ya usan
  Imputación y Orden de Sanción), en vez de quedar solo texto.
- El sello de firma pasa a ser el mismo patrón que ya usan Imputación y
  Orden de Sanción: línea punteada + OA-código + nombre + grado, Arial
  Narrow 8pt centrado, en vez de una línea de firma genérica.
- Corrige la unidad del encabezado a la designación real de Hans:
  "COMOPPOL PNP/REGPOL-CALLAO/DIVOPUS-VENTANILLA-COM VENTANILLA MYD".

Co-Authored-By: Claude Sonnet 5 <noreply@anthropic.com>
</commit_message>
<xml_diff>
--- a/plantillas/plantilla_archivo_leve.docx
+++ b/plantillas/plantilla_archivo_leve.docx
@@ -4,6 +4,52 @@
   <w:body>
     <w:p>
       <w:pPr>
+        <w:spacing w:after="200"/>
+        <w:jc w:val="center"/>
+      </w:pPr>
+      <w:r>
+        <w:drawing>
+          <wp:inline distT="0" distB="0" distL="0" distR="0">
+            <wp:extent cx="857250" cy="1047750"/>
+            <wp:effectExtent t="0" r="0" b="0" l="0"/>
+            <wp:docPr id="1" name="" descr="" title=""/>
+            <wp:cNvGraphicFramePr>
+              <a:graphicFrameLocks xmlns:a="http://schemas.openxmlformats.org/drawingml/2006/main" noChangeAspect="1"/>
+            </wp:cNvGraphicFramePr>
+            <a:graphic xmlns:a="http://schemas.openxmlformats.org/drawingml/2006/main">
+              <a:graphicData uri="http://schemas.openxmlformats.org/drawingml/2006/picture">
+                <pic:pic xmlns:pic="http://schemas.openxmlformats.org/drawingml/2006/picture">
+                  <pic:nvPicPr>
+                    <pic:cNvPr id="0" name="" descr=""/>
+                    <pic:cNvPicPr>
+                      <a:picLocks noChangeAspect="1" noChangeArrowheads="1"/>
+                    </pic:cNvPicPr>
+                  </pic:nvPicPr>
+                  <pic:blipFill>
+                    <a:blip r:embed="rId7" cstate="none"/>
+                    <a:srcRect/>
+                    <a:stretch>
+                      <a:fillRect/>
+                    </a:stretch>
+                  </pic:blipFill>
+                  <pic:spPr bwMode="auto">
+                    <a:xfrm>
+                      <a:off x="0" y="0"/>
+                      <a:ext cx="857250" cy="1047750"/>
+                    </a:xfrm>
+                    <a:prstGeom prst="rect">
+                      <a:avLst/>
+                    </a:prstGeom>
+                  </pic:spPr>
+                </pic:pic>
+              </a:graphicData>
+            </a:graphic>
+          </wp:inline>
+        </w:drawing>
+      </w:r>
+    </w:p>
+    <w:p>
+      <w:pPr>
         <w:spacing w:after="0"/>
         <w:jc w:val="center"/>
       </w:pPr>
@@ -36,22 +82,6 @@
     </w:p>
     <w:p>
       <w:pPr>
-        <w:spacing w:after="0"/>
-        <w:jc w:val="center"/>
-      </w:pPr>
-      <w:r>
-        <w:rPr>
-          <w:rFonts w:ascii="Arial" w:cs="Arial" w:eastAsia="Arial" w:hAnsi="Arial"/>
-          <w:b/>
-          <w:bCs/>
-          <w:sz w:val="24"/>
-          <w:szCs w:val="24"/>
-        </w:rPr>
-        <w:t xml:space="preserve">COMISARÍA PNP VENTANILLA "A" - REGPOL CALLAO</w:t>
-      </w:r>
-    </w:p>
-    <w:p>
-      <w:pPr>
         <w:spacing w:after="200"/>
         <w:jc w:val="center"/>
       </w:pPr>
@@ -63,7 +93,7 @@
           <w:sz w:val="24"/>
           <w:szCs w:val="24"/>
         </w:rPr>
-        <w:t xml:space="preserve">(ARCHIVO – PRIMERA INSTANCIA)</w:t>
+        <w:t xml:space="preserve">COMOPPOL PNP/REGPOL-CALLAO/DIVOPUS-VENTANILLA-COM VENTANILLA “MYD”</w:t>
       </w:r>
     </w:p>
     <w:p>
@@ -138,7 +168,7 @@
           <w:sz w:val="24"/>
           <w:szCs w:val="24"/>
         </w:rPr>
-        <w:t xml:space="preserve">ASUNTO : </w:t>
+        <w:t xml:space="preserve">ASUNTO</w:t>
       </w:r>
       <w:r>
         <w:rPr>
@@ -148,7 +178,7 @@
           <w:sz w:val="24"/>
           <w:szCs w:val="24"/>
         </w:rPr>
-        <w:t xml:space="preserve">Archivo de Procedimiento Administrativo Disciplinario por Infracción Leve.</w:t>
+        <w:t xml:space="preserve"> : Archivo de Procedimiento Administrativo Disciplinario por Infracción Leve.</w:t>
       </w:r>
     </w:p>
     <w:p>
@@ -240,7 +270,7 @@
     </w:p>
     <w:p>
       <w:pPr>
-        <w:spacing w:after="700"/>
+        <w:spacing w:after="900"/>
         <w:ind w:firstLine="360"/>
         <w:jc w:val="both"/>
       </w:pPr>
@@ -272,13 +302,11 @@
       </w:pPr>
       <w:r>
         <w:rPr>
-          <w:rFonts w:ascii="Arial" w:cs="Arial" w:eastAsia="Arial" w:hAnsi="Arial"/>
-          <w:b w:val="false"/>
-          <w:bCs w:val="false"/>
-          <w:sz w:val="24"/>
-          <w:szCs w:val="24"/>
-        </w:rPr>
-        <w:t xml:space="preserve">_________________________________</w:t>
+          <w:rFonts w:ascii="Arial Narrow" w:cs="Arial Narrow" w:eastAsia="Arial Narrow" w:hAnsi="Arial Narrow"/>
+          <w:sz w:val="16"/>
+          <w:szCs w:val="16"/>
+        </w:rPr>
+        <w:t xml:space="preserve">----------------------------------------------------</w:t>
       </w:r>
     </w:p>
     <w:p>
@@ -288,13 +316,11 @@
       </w:pPr>
       <w:r>
         <w:rPr>
-          <w:rFonts w:ascii="Arial" w:cs="Arial" w:eastAsia="Arial" w:hAnsi="Arial"/>
-          <w:b w:val="false"/>
-          <w:bCs w:val="false"/>
-          <w:sz w:val="24"/>
-          <w:szCs w:val="24"/>
-        </w:rPr>
-        <w:t xml:space="preserve">{signer_grado} {signer_nombre}</w:t>
+          <w:rFonts w:ascii="Arial Narrow" w:cs="Arial Narrow" w:eastAsia="Arial Narrow" w:hAnsi="Arial Narrow"/>
+          <w:sz w:val="16"/>
+          <w:szCs w:val="16"/>
+        </w:rPr>
+        <w:t xml:space="preserve">{signer_oa}</w:t>
       </w:r>
     </w:p>
     <w:p>
@@ -304,13 +330,25 @@
       </w:pPr>
       <w:r>
         <w:rPr>
-          <w:rFonts w:ascii="Arial" w:cs="Arial" w:eastAsia="Arial" w:hAnsi="Arial"/>
-          <w:b w:val="false"/>
-          <w:bCs w:val="false"/>
-          <w:sz w:val="24"/>
-          <w:szCs w:val="24"/>
-        </w:rPr>
-        <w:t xml:space="preserve">{signer_oa}</w:t>
+          <w:rFonts w:ascii="Arial Narrow" w:cs="Arial Narrow" w:eastAsia="Arial Narrow" w:hAnsi="Arial Narrow"/>
+          <w:sz w:val="16"/>
+          <w:szCs w:val="16"/>
+        </w:rPr>
+        <w:t xml:space="preserve">{signer_nombre}</w:t>
+      </w:r>
+    </w:p>
+    <w:p>
+      <w:pPr>
+        <w:spacing w:after="0"/>
+        <w:jc w:val="center"/>
+      </w:pPr>
+      <w:r>
+        <w:rPr>
+          <w:rFonts w:ascii="Arial Narrow" w:cs="Arial Narrow" w:eastAsia="Arial Narrow" w:hAnsi="Arial Narrow"/>
+          <w:sz w:val="16"/>
+          <w:szCs w:val="16"/>
+        </w:rPr>
+        <w:t xml:space="preserve">{signer_grado}</w:t>
       </w:r>
     </w:p>
     <w:sectPr>

</xml_diff>

<commit_message>
Ajusta el sello del Archivo del Procedimiento: modelo real y objeto movible
- Encabezado: unidad simplificada a "DIVOPUS VENTANILLA - COM. VENTANILLA".
- Sello: reemplaza el extraído de Imputación por el que realmente usa
  INFORME ADMINISTRATIVO DISCIPLINARIO -.docx (doble arco "POLICIA NACIONAL
  DEL PERU" / "COMISARIA DE VENTANILLA" + "DIVOPUS 03 VENTANILLA").
- El sello y el bloque de firma (OA/nombre/grado) ahora van dentro de un
  mismo objeto flotante (ancla, no inline) a un costado, movible en Word
  igual que el resto de sellos de la app, en vez de apilados verticalmente.

Co-Authored-By: Claude Sonnet 5 <noreply@anthropic.com>
</commit_message>
<xml_diff>
--- a/plantillas/plantilla_archivo_leve.docx
+++ b/plantillas/plantilla_archivo_leve.docx
@@ -10,7 +10,7 @@
       <w:r>
         <w:drawing>
           <wp:inline distT="0" distB="0" distL="0" distR="0">
-            <wp:extent cx="857250" cy="1047750"/>
+            <wp:extent cx="904875" cy="1123950"/>
             <wp:effectExtent t="0" r="0" b="0" l="0"/>
             <wp:docPr id="1" name="" descr="" title=""/>
             <wp:cNvGraphicFramePr>
@@ -35,7 +35,7 @@
                   <pic:spPr bwMode="auto">
                     <a:xfrm>
                       <a:off x="0" y="0"/>
-                      <a:ext cx="857250" cy="1047750"/>
+                      <a:ext cx="904875" cy="1123950"/>
                     </a:xfrm>
                     <a:prstGeom prst="rect">
                       <a:avLst/>
@@ -82,6 +82,38 @@
     </w:p>
     <w:p>
       <w:pPr>
+        <w:spacing w:after="0"/>
+        <w:jc w:val="center"/>
+      </w:pPr>
+      <w:r>
+        <w:rPr>
+          <w:rFonts w:ascii="Arial" w:cs="Arial" w:eastAsia="Arial" w:hAnsi="Arial"/>
+          <w:b/>
+          <w:bCs/>
+          <w:sz w:val="24"/>
+          <w:szCs w:val="24"/>
+        </w:rPr>
+        <w:t xml:space="preserve">DIVOPUS VENTANILLA - COM. VENTANILLA</w:t>
+      </w:r>
+    </w:p>
+    <w:p>
+      <w:pPr>
+        <w:spacing w:after="0"/>
+        <w:jc w:val="center"/>
+      </w:pPr>
+      <w:r>
+        <w:rPr>
+          <w:rFonts w:ascii="Arial" w:cs="Arial" w:eastAsia="Arial" w:hAnsi="Arial"/>
+          <w:b w:val="false"/>
+          <w:bCs w:val="false"/>
+          <w:sz w:val="24"/>
+          <w:szCs w:val="24"/>
+        </w:rPr>
+        <w:t xml:space="preserve">AV. PEDRO BELTRAN Nº139 - URB. SATÉLITE - VENTANILLA</w:t>
+      </w:r>
+    </w:p>
+    <w:p>
+      <w:pPr>
         <w:spacing w:after="200"/>
         <w:jc w:val="center"/>
       </w:pPr>
@@ -93,7 +125,7 @@
           <w:sz w:val="24"/>
           <w:szCs w:val="24"/>
         </w:rPr>
-        <w:t xml:space="preserve">COMOPPOL PNP/REGPOL-CALLAO/DIVOPUS-VENTANILLA-COM VENTANILLA “MYD”</w:t>
+        <w:t xml:space="preserve">(ARCHIVO – PRIMERA INSTANCIA)</w:t>
       </w:r>
     </w:p>
     <w:p>
@@ -270,7 +302,7 @@
     </w:p>
     <w:p>
       <w:pPr>
-        <w:spacing w:after="900"/>
+        <w:spacing w:after="200"/>
         <w:ind w:firstLine="360"/>
         <w:jc w:val="both"/>
       </w:pPr>
@@ -297,58 +329,550 @@
     </w:p>
     <w:p>
       <w:pPr>
-        <w:spacing w:after="0"/>
         <w:jc w:val="center"/>
       </w:pPr>
       <w:r>
-        <w:rPr>
-          <w:rFonts w:ascii="Arial Narrow" w:cs="Arial Narrow" w:eastAsia="Arial Narrow" w:hAnsi="Arial Narrow"/>
-          <w:sz w:val="16"/>
-          <w:szCs w:val="16"/>
-        </w:rPr>
-        <w:t xml:space="preserve">----------------------------------------------------</w:t>
-      </w:r>
-    </w:p>
-    <w:p>
-      <w:pPr>
-        <w:spacing w:after="0"/>
-        <w:jc w:val="center"/>
-      </w:pPr>
-      <w:r>
-        <w:rPr>
-          <w:rFonts w:ascii="Arial Narrow" w:cs="Arial Narrow" w:eastAsia="Arial Narrow" w:hAnsi="Arial Narrow"/>
-          <w:sz w:val="16"/>
-          <w:szCs w:val="16"/>
-        </w:rPr>
-        <w:t xml:space="preserve">{signer_oa}</w:t>
-      </w:r>
-    </w:p>
-    <w:p>
-      <w:pPr>
-        <w:spacing w:after="0"/>
-        <w:jc w:val="center"/>
-      </w:pPr>
-      <w:r>
-        <w:rPr>
-          <w:rFonts w:ascii="Arial Narrow" w:cs="Arial Narrow" w:eastAsia="Arial Narrow" w:hAnsi="Arial Narrow"/>
-          <w:sz w:val="16"/>
-          <w:szCs w:val="16"/>
-        </w:rPr>
-        <w:t xml:space="preserve">{signer_nombre}</w:t>
-      </w:r>
-    </w:p>
-    <w:p>
-      <w:pPr>
-        <w:spacing w:after="0"/>
-        <w:jc w:val="center"/>
-      </w:pPr>
-      <w:r>
-        <w:rPr>
-          <w:rFonts w:ascii="Arial Narrow" w:cs="Arial Narrow" w:eastAsia="Arial Narrow" w:hAnsi="Arial Narrow"/>
-          <w:sz w:val="16"/>
-          <w:szCs w:val="16"/>
-        </w:rPr>
-        <w:t xml:space="preserve">{signer_grado}</w:t>
+        <w:drawing>
+          <wp:anchor distT="0" distB="0" distL="114300" distR="114300" simplePos="0" relativeHeight="251664384" behindDoc="0" locked="0" layoutInCell="1" allowOverlap="1" wp14:anchorId="5A3B08F1" wp14:editId="5A3B5A7C">
+            <wp:simplePos x="0" y="0"/>
+            <wp:positionH relativeFrom="margin">
+              <wp:posOffset>2158316</wp:posOffset>
+            </wp:positionH>
+            <wp:positionV relativeFrom="paragraph">
+              <wp:posOffset>283245</wp:posOffset>
+            </wp:positionV>
+            <wp:extent cx="2702560" cy="1323975"/>
+            <wp:effectExtent l="0" t="0" r="2540" b="9525"/>
+            <wp:wrapNone/>
+            <wp:docPr id="900001" name="SelloRedondoArchivo"/>
+            <wp:cNvGraphicFramePr/>
+            <a:graphic xmlns:a="http://schemas.openxmlformats.org/drawingml/2006/main">
+              <a:graphicData uri="http://schemas.microsoft.com/office/word/2010/wordprocessingGroup">
+                <wpg:wgp>
+                  <wpg:cNvGrpSpPr/>
+                  <wpg:grpSpPr>
+                    <a:xfrm>
+                      <a:off x="0" y="0"/>
+                      <a:ext cx="2702560" cy="1323975"/>
+                      <a:chOff x="0" y="0"/>
+                      <a:chExt cx="2702768" cy="1323882"/>
+                    </a:xfrm>
+                  </wpg:grpSpPr>
+                  <wpg:grpSp>
+                    <wpg:cNvPr id="239770182" name="Grupo 239770182"/>
+                    <wpg:cNvGrpSpPr/>
+                    <wpg:grpSpPr>
+                      <a:xfrm>
+                        <a:off x="0" y="0"/>
+                        <a:ext cx="1245866" cy="1213983"/>
+                        <a:chOff x="0" y="0"/>
+                        <a:chExt cx="1245870" cy="1214120"/>
+                      </a:xfrm>
+                    </wpg:grpSpPr>
+                    <wpg:grpSp>
+                      <wpg:cNvPr id="1369127984" name="Grupo 1369127984"/>
+                      <wpg:cNvGrpSpPr/>
+                      <wpg:grpSpPr>
+                        <a:xfrm>
+                          <a:off x="0" y="0"/>
+                          <a:ext cx="1245870" cy="1214120"/>
+                          <a:chOff x="0" y="0"/>
+                          <a:chExt cx="1245870" cy="1214120"/>
+                        </a:xfrm>
+                      </wpg:grpSpPr>
+                      <wpg:grpSp>
+                        <wpg:cNvPr id="1093972332" name="Grupo 1093972332"/>
+                        <wpg:cNvGrpSpPr/>
+                        <wpg:grpSpPr>
+                          <a:xfrm>
+                            <a:off x="37678" y="70123"/>
+                            <a:ext cx="1173480" cy="1089025"/>
+                            <a:chOff x="37678" y="70123"/>
+                            <a:chExt cx="1173480" cy="1089025"/>
+                          </a:xfrm>
+                        </wpg:grpSpPr>
+                        <wps:wsp>
+                          <wps:cNvPr id="132997527" name="Cuadro de texto 1031461181"/>
+                          <wps:cNvSpPr txBox="1"/>
+                          <wps:spPr>
+                            <a:xfrm>
+                              <a:off x="37678" y="70123"/>
+                              <a:ext cx="1173480" cy="1089025"/>
+                            </a:xfrm>
+                            <a:prstGeom prst="rect">
+                              <a:avLst/>
+                            </a:prstGeom>
+                            <a:noFill/>
+                            <a:ln>
+                              <a:noFill/>
+                            </a:ln>
+                          </wps:spPr>
+                          <wps:txbx>
+                            <w:txbxContent>
+                              <w:p>
+                                <w:pPr>
+                                  <w:jc w:val="center"/>
+                                  <w:rPr>
+                                    <w:rFonts w:ascii="Arial" w:hAnsi="Arial" w:cs="Arial"/>
+                                    <w:noProof/>
+                                    <w:sz w:val="18"/>
+                                    <w:szCs w:val="18"/>
+                                    <w14:textOutline w14:w="3175" w14:cap="flat" w14:cmpd="sng" w14:algn="ctr">
+                                      <w14:solidFill>
+                                        <w14:srgbClr w14:val="000000"/>
+                                      </w14:solidFill>
+                                      <w14:prstDash w14:val="solid"/>
+                                      <w14:round/>
+                                    </w14:textOutline>
+                                  </w:rPr>
+                                </w:pPr>
+                                <w:r>
+                                  <w:rPr>
+                                    <w:rFonts w:ascii="Arial" w:hAnsi="Arial" w:cs="Arial"/>
+                                    <w:sz w:val="18"/>
+                                    <w:szCs w:val="18"/>
+                                    <w14:textOutline w14:w="3175" w14:cap="flat" w14:cmpd="sng" w14:algn="ctr">
+                                      <w14:solidFill>
+                                        <w14:srgbClr w14:val="000000"/>
+                                      </w14:solidFill>
+                                      <w14:prstDash w14:val="solid"/>
+                                      <w14:round/>
+                                    </w14:textOutline>
+                                  </w:rPr>
+                                  <w:t>POLICIA NACIONAL DEL PERÚ</w:t>
+                                </w:r>
+                              </w:p>
+                            </w:txbxContent>
+                          </wps:txbx>
+                          <wps:bodyPr rot="0" spcFirstLastPara="1" vert="horz" wrap="square" lIns="91440" tIns="45720" rIns="91440" bIns="45720" numCol="1" spcCol="0" rtlCol="0" fromWordArt="0" anchor="t" anchorCtr="0" forceAA="0" compatLnSpc="1">
+                            <a:prstTxWarp prst="textArchUp">
+                              <a:avLst>
+                                <a:gd name="adj" fmla="val 10942147"/>
+                              </a:avLst>
+                            </a:prstTxWarp>
+                            <a:noAutofit/>
+                          </wps:bodyPr>
+                        </wps:wsp>
+                        <wps:wsp>
+                          <wps:cNvPr id="1071189311" name="Elipse 1071189311"/>
+                          <wps:cNvSpPr/>
+                          <wps:spPr>
+                            <a:xfrm>
+                              <a:off x="112740" y="111067"/>
+                              <a:ext cx="1008000" cy="1008000"/>
+                            </a:xfrm>
+                            <a:prstGeom prst="ellipse">
+                              <a:avLst/>
+                            </a:prstGeom>
+                            <a:noFill/>
+                            <a:ln w="9525">
+                              <a:solidFill>
+                                <a:schemeClr val="tx1"/>
+                              </a:solidFill>
+                            </a:ln>
+                          </wps:spPr>
+                          <wps:style>
+                            <a:lnRef idx="2">
+                              <a:schemeClr val="accent1">
+                                <a:shade val="50000"/>
+                              </a:schemeClr>
+                            </a:lnRef>
+                            <a:fillRef idx="1">
+                              <a:schemeClr val="accent1"/>
+                            </a:fillRef>
+                            <a:effectRef idx="0">
+                              <a:schemeClr val="accent1"/>
+                            </a:effectRef>
+                            <a:fontRef idx="minor">
+                              <a:schemeClr val="lt1"/>
+                            </a:fontRef>
+                          </wps:style>
+                          <wps:bodyPr rot="0" spcFirstLastPara="0" vert="horz" wrap="square" lIns="91440" tIns="45720" rIns="91440" bIns="45720" numCol="1" spcCol="0" rtlCol="0" fromWordArt="0" anchor="ctr" anchorCtr="0" forceAA="0" compatLnSpc="1">
+                            <a:prstTxWarp prst="textNoShape">
+                              <a:avLst/>
+                            </a:prstTxWarp>
+                            <a:noAutofit/>
+                          </wps:bodyPr>
+                        </wps:wsp>
+                        <wps:wsp>
+                          <wps:cNvPr id="2001689847" name="Elipse 2001689847"/>
+                          <wps:cNvSpPr/>
+                          <wps:spPr>
+                            <a:xfrm>
+                              <a:off x="256042" y="261192"/>
+                              <a:ext cx="720000" cy="720000"/>
+                            </a:xfrm>
+                            <a:prstGeom prst="ellipse">
+                              <a:avLst/>
+                            </a:prstGeom>
+                            <a:noFill/>
+                            <a:ln w="9525">
+                              <a:solidFill>
+                                <a:schemeClr val="tx1"/>
+                              </a:solidFill>
+                            </a:ln>
+                          </wps:spPr>
+                          <wps:style>
+                            <a:lnRef idx="2">
+                              <a:schemeClr val="accent1">
+                                <a:shade val="50000"/>
+                              </a:schemeClr>
+                            </a:lnRef>
+                            <a:fillRef idx="1">
+                              <a:schemeClr val="accent1"/>
+                            </a:fillRef>
+                            <a:effectRef idx="0">
+                              <a:schemeClr val="accent1"/>
+                            </a:effectRef>
+                            <a:fontRef idx="minor">
+                              <a:schemeClr val="lt1"/>
+                            </a:fontRef>
+                          </wps:style>
+                          <wps:txbx>
+                            <w:txbxContent>
+                              <w:p>
+                                <w:r>
+                                  <w:rPr>
+                                    <w:noProof/>
+                                    <w:sz w:val="20"/>
+                                    <w:szCs w:val="20"/>
+                                    <w:lang w:eastAsia="es-PE"/>
+                                  </w:rPr>
+                                  <w:drawing>
+                                    <wp:inline distT="0" distB="0" distL="0" distR="0" wp14:anchorId="7B9B5EAF" wp14:editId="128C61BA">
+                                      <wp:extent cx="314325" cy="402590"/>
+                                      <wp:effectExtent l="0" t="0" r="9525" b="0"/>
+                                      <wp:docPr id="757504423" name="Imagen 757504423" descr="Search: escudo republica del peru Logo Vectors Free Download"/>
+                                      <wp:cNvGraphicFramePr>
+                                        <a:graphicFrameLocks xmlns:a="http://schemas.openxmlformats.org/drawingml/2006/main" noChangeAspect="1"/>
+                                      </wp:cNvGraphicFramePr>
+                                      <a:graphic xmlns:a="http://schemas.openxmlformats.org/drawingml/2006/main">
+                                        <a:graphicData uri="http://schemas.openxmlformats.org/drawingml/2006/picture">
+                                          <pic:pic xmlns:pic="http://schemas.openxmlformats.org/drawingml/2006/picture">
+                                            <pic:nvPicPr>
+                                              <pic:cNvPr id="0" name="Imagen 1031465868" descr="Search: escudo republica del peru Logo Vectors Free Download"/>
+                                              <pic:cNvPicPr>
+                                                <a:picLocks noChangeAspect="1" noChangeArrowheads="1"/>
+                                              </pic:cNvPicPr>
+                                            </pic:nvPicPr>
+                                            <pic:blipFill>
+                                              <a:blip r:embed="rId9">
+                                                <a:extLst>
+                                                  <a:ext uri="{28A0092B-C50C-407E-A947-70E740481C1C}">
+                                                    <a14:useLocalDpi xmlns:a14="http://schemas.microsoft.com/office/drawing/2010/main" val="0"/>
+                                                  </a:ext>
+                                                </a:extLst>
+                                              </a:blip>
+                                              <a:srcRect/>
+                                              <a:stretch>
+                                                <a:fillRect/>
+                                              </a:stretch>
+                                            </pic:blipFill>
+                                            <pic:spPr bwMode="auto">
+                                              <a:xfrm>
+                                                <a:off x="0" y="0"/>
+                                                <a:ext cx="314325" cy="402590"/>
+                                              </a:xfrm>
+                                              <a:prstGeom prst="rect">
+                                                <a:avLst/>
+                                              </a:prstGeom>
+                                              <a:noFill/>
+                                              <a:ln>
+                                                <a:noFill/>
+                                              </a:ln>
+                                            </pic:spPr>
+                                          </pic:pic>
+                                        </a:graphicData>
+                                      </a:graphic>
+                                    </wp:inline>
+                                  </w:drawing>
+                                </w:r>
+                              </w:p>
+                            </w:txbxContent>
+                          </wps:txbx>
+                          <wps:bodyPr rot="0" spcFirstLastPara="0" vert="horz" wrap="square" lIns="91440" tIns="45720" rIns="91440" bIns="45720" numCol="1" spcCol="0" rtlCol="0" fromWordArt="0" anchor="ctr" anchorCtr="0" forceAA="0" compatLnSpc="1">
+                            <a:prstTxWarp prst="textNoShape">
+                              <a:avLst/>
+                            </a:prstTxWarp>
+                            <a:noAutofit/>
+                          </wps:bodyPr>
+                        </wps:wsp>
+                      </wpg:grpSp>
+                      <wpg:grpSp>
+                        <wpg:cNvPr id="1726288789" name="Grupo 1726288789"/>
+                        <wpg:cNvGrpSpPr/>
+                        <wpg:grpSpPr>
+                          <a:xfrm>
+                            <a:off x="0" y="0"/>
+                            <a:ext cx="1245870" cy="1214120"/>
+                            <a:chOff x="0" y="0"/>
+                            <a:chExt cx="1245870" cy="1214120"/>
+                          </a:xfrm>
+                        </wpg:grpSpPr>
+                        <wps:wsp>
+                          <wps:cNvPr id="181469948" name="Cuadro de texto 1031461185"/>
+                          <wps:cNvSpPr txBox="1"/>
+                          <wps:spPr>
+                            <a:xfrm>
+                              <a:off x="0" y="0"/>
+                              <a:ext cx="1245870" cy="1214120"/>
+                            </a:xfrm>
+                            <a:prstGeom prst="rect">
+                              <a:avLst/>
+                            </a:prstGeom>
+                            <a:noFill/>
+                            <a:ln>
+                              <a:noFill/>
+                            </a:ln>
+                          </wps:spPr>
+                          <wps:txbx>
+                            <w:txbxContent>
+                              <w:p>
+                                <w:pPr>
+                                  <w:jc w:val="center"/>
+                                  <w:rPr>
+                                    <w:rFonts w:ascii="Arial" w:hAnsi="Arial" w:cs="Arial"/>
+                                    <w:b/>
+                                    <w:bCs/>
+                                    <w:noProof/>
+                                    <w:sz w:val="18"/>
+                                    <w:szCs w:val="18"/>
+                                    <w:lang w:val="es-MX"/>
+                                    <w14:textOutline w14:w="0" w14:cap="flat" w14:cmpd="sng" w14:algn="ctr">
+                                      <w14:noFill/>
+                                      <w14:prstDash w14:val="solid"/>
+                                      <w14:round/>
+                                    </w14:textOutline>
+                                  </w:rPr>
+                                </w:pPr>
+                                <w:r>
+                                  <w:rPr>
+                                    <w:rFonts w:ascii="Arial" w:hAnsi="Arial" w:cs="Arial"/>
+                                    <w:b/>
+                                    <w:bCs/>
+                                    <w:noProof/>
+                                    <w:sz w:val="18"/>
+                                    <w:szCs w:val="18"/>
+                                    <w:lang w:val="es-MX"/>
+                                    <w14:textOutline w14:w="0" w14:cap="flat" w14:cmpd="sng" w14:algn="ctr">
+                                      <w14:noFill/>
+                                      <w14:prstDash w14:val="solid"/>
+                                      <w14:round/>
+                                    </w14:textOutline>
+                                  </w:rPr>
+                                  <w:t>- COMISARÍA DE VENTANILLA -</w:t>
+                                </w:r>
+                              </w:p>
+                            </w:txbxContent>
+                          </wps:txbx>
+                          <wps:bodyPr rot="0" spcFirstLastPara="1" vert="horz" wrap="square" lIns="91440" tIns="45720" rIns="91440" bIns="45720" numCol="1" spcCol="0" rtlCol="0" fromWordArt="0" anchor="t" anchorCtr="0" forceAA="0" compatLnSpc="1">
+                            <a:prstTxWarp prst="textArchDown">
+                              <a:avLst>
+                                <a:gd name="adj" fmla="val 178777"/>
+                              </a:avLst>
+                            </a:prstTxWarp>
+                            <a:noAutofit/>
+                          </wps:bodyPr>
+                        </wps:wsp>
+                        <wps:wsp>
+                          <wps:cNvPr id="1221765252" name="Elipse 1221765252"/>
+                          <wps:cNvSpPr/>
+                          <wps:spPr>
+                            <a:xfrm>
+                              <a:off x="75063" y="75062"/>
+                              <a:ext cx="1080000" cy="1080000"/>
+                            </a:xfrm>
+                            <a:prstGeom prst="ellipse">
+                              <a:avLst/>
+                            </a:prstGeom>
+                            <a:noFill/>
+                            <a:ln w="9525">
+                              <a:solidFill>
+                                <a:schemeClr val="tx1"/>
+                              </a:solidFill>
+                            </a:ln>
+                          </wps:spPr>
+                          <wps:style>
+                            <a:lnRef idx="2">
+                              <a:schemeClr val="accent1">
+                                <a:shade val="50000"/>
+                              </a:schemeClr>
+                            </a:lnRef>
+                            <a:fillRef idx="1">
+                              <a:schemeClr val="accent1"/>
+                            </a:fillRef>
+                            <a:effectRef idx="0">
+                              <a:schemeClr val="accent1"/>
+                            </a:effectRef>
+                            <a:fontRef idx="minor">
+                              <a:schemeClr val="lt1"/>
+                            </a:fontRef>
+                          </wps:style>
+                          <wps:bodyPr rot="0" spcFirstLastPara="0" vert="horz" wrap="square" lIns="91440" tIns="45720" rIns="91440" bIns="45720" numCol="1" spcCol="0" rtlCol="0" fromWordArt="0" anchor="ctr" anchorCtr="0" forceAA="0" compatLnSpc="1">
+                            <a:prstTxWarp prst="textNoShape">
+                              <a:avLst/>
+                            </a:prstTxWarp>
+                            <a:noAutofit/>
+                          </wps:bodyPr>
+                        </wps:wsp>
+                      </wpg:grpSp>
+                    </wpg:grpSp>
+                    <wps:wsp>
+                      <wps:cNvPr id="121164779" name="Cuadro de texto 1031461187"/>
+                      <wps:cNvSpPr txBox="1"/>
+                      <wps:spPr>
+                        <a:xfrm>
+                          <a:off x="177924" y="347809"/>
+                          <a:ext cx="887730" cy="694055"/>
+                        </a:xfrm>
+                        <a:prstGeom prst="rect">
+                          <a:avLst/>
+                        </a:prstGeom>
+                        <a:noFill/>
+                        <a:ln>
+                          <a:noFill/>
+                        </a:ln>
+                      </wps:spPr>
+                      <wps:txbx>
+                        <w:txbxContent>
+                          <w:p>
+                            <w:pPr>
+                              <w:jc w:val="center"/>
+                              <w:rPr>
+                                <w:rFonts w:ascii="Arial" w:hAnsi="Arial" w:cs="Arial"/>
+                                <w:b/>
+                                <w:bCs/>
+                                <w:noProof/>
+                                <w:sz w:val="14"/>
+                                <w:szCs w:val="14"/>
+                                <w:lang w:val="es-MX"/>
+                                <w14:textOutline w14:w="0" w14:cap="flat" w14:cmpd="sng" w14:algn="ctr">
+                                  <w14:noFill/>
+                                  <w14:prstDash w14:val="solid"/>
+                                  <w14:round/>
+                                </w14:textOutline>
+                              </w:rPr>
+                            </w:pPr>
+                            <w:r>
+                              <w:rPr>
+                                <w:rFonts w:ascii="Arial" w:hAnsi="Arial" w:cs="Arial"/>
+                                <w:b/>
+                                <w:bCs/>
+                                <w:noProof/>
+                                <w:sz w:val="14"/>
+                                <w:szCs w:val="14"/>
+                                <w:lang w:val="es-MX"/>
+                                <w14:textOutline w14:w="0" w14:cap="flat" w14:cmpd="sng" w14:algn="ctr">
+                                  <w14:noFill/>
+                                  <w14:prstDash w14:val="solid"/>
+                                  <w14:round/>
+                                </w14:textOutline>
+                              </w:rPr>
+                              <w:t>DIVOPUS 03 VENTANILLA</w:t>
+                            </w:r>
+                          </w:p>
+                        </w:txbxContent>
+                      </wps:txbx>
+                      <wps:bodyPr rot="0" spcFirstLastPara="1" vert="horz" wrap="square" lIns="91440" tIns="45720" rIns="91440" bIns="45720" numCol="1" spcCol="0" rtlCol="0" fromWordArt="0" anchor="t" anchorCtr="0" forceAA="0" compatLnSpc="1">
+                        <a:prstTxWarp prst="textArchDown">
+                          <a:avLst>
+                            <a:gd name="adj" fmla="val 981495"/>
+                          </a:avLst>
+                        </a:prstTxWarp>
+                        <a:noAutofit/>
+                      </wps:bodyPr>
+                    </wps:wsp>
+                  </wpg:grpSp>
+                  <wps:wsp>
+                    <wps:cNvPr id="680869463" name="Cuadro de texto 1031461188"/>
+                    <wps:cNvSpPr txBox="1">
+                      <a:spLocks noChangeArrowheads="1"/>
+                    </wps:cNvSpPr>
+                    <wps:spPr bwMode="auto">
+                      <a:xfrm>
+                        <a:off x="1047750" y="504825"/>
+                        <a:ext cx="1655018" cy="819057"/>
+                      </a:xfrm>
+                      <a:prstGeom prst="rect">
+                        <a:avLst/>
+                      </a:prstGeom>
+                      <a:noFill/>
+                      <a:ln>
+                        <a:noFill/>
+                      </a:ln>
+                    </wps:spPr>
+                    <wps:txbx>
+                      <w:txbxContent>
+                        <w:p>
+                          <w:pPr>
+                            <w:spacing w:after="0"/>
+                            <w:jc w:val="center"/>
+                          </w:pPr>
+                          <w:r>
+                            <w:rPr>
+                              <w:rFonts w:ascii="Arial Narrow" w:hAnsi="Arial Narrow" w:cs="Arial Narrow"/>
+                              <w:sz w:val="16"/>
+                              <w:szCs w:val="16"/>
+                            </w:rPr>
+                            <w:t>----------------------------------------------------</w:t>
+                          </w:r>
+                        </w:p>
+                        <w:p>
+                          <w:pPr>
+                            <w:spacing w:after="0"/>
+                            <w:ind w:left="708" w:hanging="708"/>
+                            <w:jc w:val="center"/>
+                          </w:pPr>
+                          <w:r>
+                            <w:rPr>
+                              <w:rFonts w:ascii="Arial Narrow" w:hAnsi="Arial Narrow" w:cs="Arial Narrow"/>
+                              <w:sz w:val="16"/>
+                              <w:szCs w:val="16"/>
+                            </w:rPr>
+                            <w:t>{signer_oa}</w:t>
+                          </w:r>
+                        </w:p>
+                        <w:p>
+                          <w:pPr>
+                            <w:spacing w:after="0"/>
+                            <w:ind w:left="708" w:hanging="708"/>
+                            <w:jc w:val="center"/>
+                          </w:pPr>
+                          <w:r>
+                            <w:rPr>
+                              <w:rFonts w:ascii="Arial Narrow" w:hAnsi="Arial Narrow" w:cs="Arial Narrow"/>
+                              <w:sz w:val="16"/>
+                              <w:szCs w:val="16"/>
+                            </w:rPr>
+                            <w:t>{signer_nombre}</w:t>
+                          </w:r>
+                        </w:p>
+                        <w:p>
+                          <w:pPr>
+                            <w:spacing w:after="0"/>
+                            <w:ind w:left="708" w:hanging="708"/>
+                            <w:jc w:val="center"/>
+                          </w:pPr>
+                          <w:r>
+                            <w:rPr>
+                              <w:rFonts w:ascii="Arial Narrow" w:hAnsi="Arial Narrow" w:cs="Arial Narrow"/>
+                              <w:sz w:val="16"/>
+                              <w:szCs w:val="16"/>
+                            </w:rPr>
+                            <w:t>{signer_grado}</w:t>
+                          </w:r>
+                        </w:p>
+                      </w:txbxContent>
+                    </wps:txbx>
+                    <wps:bodyPr rot="0" vert="horz" wrap="square" lIns="91440" tIns="45720" rIns="91440" bIns="45720" anchor="t" anchorCtr="0" upright="1">
+                      <a:noAutofit/>
+                    </wps:bodyPr>
+                  </wps:wsp>
+                </wpg:wgp>
+              </a:graphicData>
+            </a:graphic>
+          </wp:anchor>
+        </w:drawing>
       </w:r>
     </w:p>
     <w:sectPr>

</xml_diff>